<commit_message>
Generate changed resume artifacts
</commit_message>
<xml_diff>
--- a/applications/anthropic/5110511008-developer-productivity/Jordan_Newman_Anthropic_Developer_Productivity_Resume.docx
+++ b/applications/anthropic/5110511008-developer-productivity/Jordan_Newman_Anthropic_Developer_Productivity_Resume.docx
@@ -322,6 +322,21 @@
         <w:t xml:space="preserve">• </w:t>
       </w:r>
       <w:r>
+        <w:t>Support about 12 teams with Azure Pipelines, reusable workflows, pipeline templates, deployment gates, and self-hosted runners, reducing manual work and development friction, enabling quicker releases, and saving developers time.</w:t>
+      </w:r>
+    </w:p>
+    <w:p>
+      <w:pPr>
+        <w:spacing w:after="16"/>
+        <w:ind w:left="230" w:hanging="173"/>
+      </w:pPr>
+      <w:r>
+        <w:rPr>
+          <w:b/>
+        </w:rPr>
+        <w:t xml:space="preserve">• </w:t>
+      </w:r>
+      <w:r>
         <w:t>Use package and dependency tooling across JavaScript, .NET, Python, Rust, FreeBSD, Linux, and macOS ecosystems, including npm, Yarn, NuGet, pip, Poetry, Cargo, Ports/</w:t>
       </w:r>
       <w:r>
@@ -501,7 +516,37 @@
         <w:t xml:space="preserve">• </w:t>
       </w:r>
       <w:r>
-        <w:t>Led large-scale, complex technical projects and engineering work throughout more than 15 years across two ISPRIME tenures; created internal technical documentation, trained most employees, and mentored two beginners over several years into technical experts and eventual company leaders.</w:t>
+        <w:t>Led large-scale, complex technical projects and engineering work throughout more than 15 years across two ISPRIME tenures, leading as many as 10 employees.</w:t>
+      </w:r>
+    </w:p>
+    <w:p>
+      <w:pPr>
+        <w:spacing w:after="16"/>
+        <w:ind w:left="230" w:hanging="173"/>
+      </w:pPr>
+      <w:r>
+        <w:rPr>
+          <w:b/>
+        </w:rPr>
+        <w:t xml:space="preserve">• </w:t>
+      </w:r>
+      <w:r>
+        <w:t>Worked independently on ambiguous technical challenges, taking nearly every ISPRIME project from an unclear problem through architecture, hands-on implementation, and production operation.</w:t>
+      </w:r>
+    </w:p>
+    <w:p>
+      <w:pPr>
+        <w:spacing w:after="16"/>
+        <w:ind w:left="230" w:hanging="173"/>
+      </w:pPr>
+      <w:r>
+        <w:rPr>
+          <w:b/>
+        </w:rPr>
+        <w:t xml:space="preserve">• </w:t>
+      </w:r>
+      <w:r>
+        <w:t>Created internal technical documentation, trained most employees, and mentored two beginners over several years into technical experts and eventual company leaders.</w:t>
       </w:r>
     </w:p>
     <w:p>
@@ -548,6 +593,21 @@
       </w:r>
       <w:r>
         <w:t>Serve on the Architecture Team, contributing to technical decisions, engineering standards, shared libraries, platform direction, documentation, developer tooling, and AI-assisted engineering workflows across teams.</w:t>
+      </w:r>
+    </w:p>
+    <w:p>
+      <w:pPr>
+        <w:spacing w:after="16"/>
+        <w:ind w:left="230" w:hanging="173"/>
+      </w:pPr>
+      <w:r>
+        <w:rPr>
+          <w:b/>
+        </w:rPr>
+        <w:t xml:space="preserve">• </w:t>
+      </w:r>
+      <w:r>
+        <w:t>Support about 12 teams with Azure Pipelines, reusable workflows, pipeline templates, deployment gates, and self-hosted runners that reduce manual work, enable quicker releases, and save developers time.</w:t>
       </w:r>
     </w:p>
     <w:p>

</xml_diff>